<commit_message>
docs: add a README, and bring it under the claims test
The repo had CLAUDE.md at its root but no README, so GitHub showed nothing on
the landing page. This one leads with the problem rather than the feature list,
states the one architectural rule and why it earns its keep, and links the SDLC
set.

README.md is now scanned by tests/test_docs_claims.py alongside the other
documents - it is the first thing anyone reads, which makes a stale number
there more visible than a stale one anywhere else. Adding it moved the test
count from 626 to 628, since the per-document checks are parametrized; every
document that quotes the total is updated.

Co-Authored-By: Claude Opus 5 <noreply@anthropic.com>
</commit_message>
<xml_diff>
--- a/docs/report/RubriQ_Report.docx
+++ b/docs/report/RubriQ_Report.docx
@@ -352,7 +352,7 @@
           <w:rFonts w:ascii="Times New Roman" w:hAnsi="Times New Roman"/>
           <w:sz w:val="24"/>
         </w:rPr>
-        <w:t>The implementation is a single Streamlit application backed by SQLite, organised so that all domain logic is free of interface code, and is covered by 626 automated tests.</w:t>
+        <w:t>The implementation is a single Streamlit application backed by SQLite, organised so that all domain logic is free of interface code, and is covered by 628 automated tests.</w:t>
       </w:r>
     </w:p>
     <w:p>
@@ -2566,7 +2566,7 @@
           <w:rFonts w:ascii="Times New Roman" w:hAnsi="Times New Roman"/>
           <w:sz w:val="24"/>
         </w:rPr>
-        <w:t>The rule is worth the discipline for three reasons. The domain becomes testable without a browser, which is why 587 of the project's 626 tests need no interface at all. Access control becomes a property of a function signature — every service function takes the acting user as its first argument and filters the database query by it — rather than something the interface is trusted to do. And if Streamlit ever became the limiting factor, the interface could be replaced without rewriting the system.</w:t>
+        <w:t>The rule is worth the discipline for three reasons. The domain becomes testable without a browser, which is why 589 of the project's 628 tests need no interface at all. Access control becomes a property of a function signature — every service function takes the acting user as its first argument and filters the database query by it — rather than something the interface is trusted to do. And if Streamlit ever became the limiting factor, the interface could be replaced without rewriting the system.</w:t>
       </w:r>
     </w:p>
     <w:p>
@@ -3839,7 +3839,7 @@
           <w:rFonts w:ascii="Times New Roman" w:hAnsi="Times New Roman"/>
           <w:sz w:val="24"/>
         </w:rPr>
-        <w:t>The project has 626 automated tests, all passing. They are summarised by area below; the complete run is kept with the source code in docs/test-report.txt.</w:t>
+        <w:t>The project has 628 automated tests, all passing. They are summarised by area below; the complete run is kept with the source code in docs/test-report.txt.</w:t>
       </w:r>
     </w:p>
     <w:tbl>

</xml_diff>

<commit_message>
docs: put the repository link in the report
Three places: the title page, §1.3 where the reader is told how the report is
organised, and the references. The §1.3 mention says what the history is for -
each phase is a separate commit, and the defects in Chapter 6 trace to the
commits that fixed them.

REPO_URL carries a comment that the repository is private at the time of
writing: hand the report in with it private and the link is dead for whoever
reads it.

Co-Authored-By: Claude Opus 5 <noreply@anthropic.com>
</commit_message>
<xml_diff>
--- a/docs/report/RubriQ_Report.docx
+++ b/docs/report/RubriQ_Report.docx
@@ -131,7 +131,7 @@
     </w:p>
     <w:p>
       <w:pPr>
-        <w:spacing w:line="240" w:lineRule="auto" w:before="0" w:after="0"/>
+        <w:spacing w:line="240" w:lineRule="auto" w:before="0" w:after="320"/>
         <w:jc w:val="center"/>
       </w:pPr>
       <w:r>
@@ -141,6 +141,20 @@
           <w:sz w:val="26"/>
         </w:rPr>
         <w:t>(2026 - 2027)</w:t>
+      </w:r>
+    </w:p>
+    <w:p>
+      <w:pPr>
+        <w:spacing w:line="240" w:lineRule="auto" w:before="0" w:after="0"/>
+        <w:jc w:val="center"/>
+      </w:pPr>
+      <w:r>
+        <w:rPr>
+          <w:rFonts w:ascii="Times New Roman" w:hAnsi="Times New Roman"/>
+          <w:b w:val="0"/>
+          <w:sz w:val="22"/>
+        </w:rPr>
+        <w:t>Source code: https://github.com/manthanvs/rubriq</w:t>
       </w:r>
     </w:p>
     <w:p>
@@ -732,6 +746,19 @@
           <w:sz w:val="24"/>
         </w:rPr>
         <w:t>Chapter 2 describes how reviews are conducted at present and why a new system is needed. Chapter 3 sets out the requirements. Chapter 4 gives the design and the diagrams. Chapter 5 describes the implementation module by module. Chapter 6 covers testing, including the defects found during development. Chapter 7 reports the results obtained, and Chapter 8 concludes with the limitations and the scope for future work.</w:t>
+      </w:r>
+    </w:p>
+    <w:p>
+      <w:pPr>
+        <w:spacing w:line="360" w:lineRule="auto"/>
+        <w:jc w:val="both"/>
+      </w:pPr>
+      <w:r>
+        <w:rPr>
+          <w:rFonts w:ascii="Times New Roman" w:hAnsi="Times New Roman"/>
+          <w:sz w:val="24"/>
+        </w:rPr>
+        <w:t>The complete source code, its commit history, and the eight supporting documents this report is assembled from are available at https://github.com/manthanvs/rubriq. The commit history is itself part of the record: each phase of the build is a separate commit, and the defects listed in Chapter 6 can be traced to the commits that fixed them.</w:t>
       </w:r>
     </w:p>
     <w:p>
@@ -6363,6 +6390,21 @@
           <w:rFonts w:ascii="Times New Roman" w:hAnsi="Times New Roman"/>
           <w:sz w:val="24"/>
         </w:rPr>
+        <w:t>RubriQ source code and commit history. https://github.com/manthanvs/rubriq</w:t>
+      </w:r>
+    </w:p>
+    <w:p>
+      <w:pPr>
+        <w:pStyle w:val="ListNumber"/>
+        <w:spacing w:line="360" w:lineRule="auto"/>
+        <w:ind w:left="720"/>
+        <w:jc w:val="both"/>
+      </w:pPr>
+      <w:r>
+        <w:rPr>
+          <w:rFonts w:ascii="Times New Roman" w:hAnsi="Times New Roman"/>
+          <w:sz w:val="24"/>
+        </w:rPr>
         <w:t>Streamlit documentation. https://docs.streamlit.io</w:t>
       </w:r>
     </w:p>

</xml_diff>

<commit_message>
fix: point the Dev Container at the entry point too, and at the stated Python
Streamlit Cloud generated .devcontainer/devcontainer.json when the app was
created, and it runs `streamlit run app/main.py` -- the entry point that
cannot import anything. It also pins Python 3.11 while the documentation
states 3.12 as the floor; nothing in the code needs 3.12 today, but a
container quietly running below the stated minimum is a claim going stale
rather than a version being chosen.

The launcher check in tests/test_entry_point.py covers this file now, so a
fifth place to name the entry point cannot drift from the other four.

Co-Authored-By: Claude Opus 5 <noreply@anthropic.com>
</commit_message>
<xml_diff>
--- a/docs/report/RubriQ_Report.docx
+++ b/docs/report/RubriQ_Report.docx
@@ -366,7 +366,7 @@
           <w:rFonts w:ascii="Times New Roman" w:hAnsi="Times New Roman"/>
           <w:sz w:val="24"/>
         </w:rPr>
-        <w:t>The implementation is a single Streamlit application backed by SQLite, organised so that all domain logic is free of interface code, and is covered by 645 automated tests.</w:t>
+        <w:t>The implementation is a single Streamlit application backed by SQLite, organised so that all domain logic is free of interface code, and is covered by 646 automated tests.</w:t>
       </w:r>
     </w:p>
     <w:p>
@@ -2619,7 +2619,7 @@
           <w:rFonts w:ascii="Times New Roman" w:hAnsi="Times New Roman"/>
           <w:sz w:val="24"/>
         </w:rPr>
-        <w:t>The rule is worth the discipline for three reasons. The domain becomes testable without a browser, which is why 589 of the project's 645 tests need no interface at all. Access control becomes a property of a function signature — every service function takes the acting user as its first argument and filters the database query by it — rather than something the interface is trusted to do. And if Streamlit ever became the limiting factor, the interface could be replaced without rewriting the system.</w:t>
+        <w:t>The rule is worth the discipline for three reasons. The domain becomes testable without a browser, which is why 589 of the project's 646 tests need no interface at all. Access control becomes a property of a function signature — every service function takes the acting user as its first argument and filters the database query by it — rather than something the interface is trusted to do. And if Streamlit ever became the limiting factor, the interface could be replaced without rewriting the system.</w:t>
       </w:r>
     </w:p>
     <w:p>
@@ -4208,7 +4208,7 @@
           <w:rFonts w:ascii="Times New Roman" w:hAnsi="Times New Roman"/>
           <w:sz w:val="24"/>
         </w:rPr>
-        <w:t>The project has 645 automated tests, all passing. They are summarised by area below; the complete run is kept with the source code in docs/test-report.txt.</w:t>
+        <w:t>The project has 646 automated tests, all passing. They are summarised by area below; the complete run is kept with the source code in docs/test-report.txt.</w:t>
       </w:r>
     </w:p>
     <w:tbl>

</xml_diff>

<commit_message>
docs: add a viva script
What to click and what to say, step by step, in words meant to be spoken
aloud rather than read. The demonstration script in deployment.md is a
checklist for someone who already knows the system; this is for standing in
front of somebody who does not.

Includes the parts that are easy to forget under pressure: reseed first, the
sixty-second opening that explains what the project is before anything is
clicked, short answers to the questions most likely to come up, and a table
of what to do when something breaks live.

The honest answers are deliberate. "Did you choose the right technology
first time?" is answered with no, and why -- it is a better answer than a
yes, and it matches the self-assessment the seeded data already carries.

Co-Authored-By: Claude Opus 5 <noreply@anthropic.com>
</commit_message>
<xml_diff>
--- a/docs/report/RubriQ_Report.docx
+++ b/docs/report/RubriQ_Report.docx
@@ -366,7 +366,7 @@
           <w:rFonts w:ascii="Times New Roman" w:hAnsi="Times New Roman"/>
           <w:sz w:val="24"/>
         </w:rPr>
-        <w:t>The implementation is a single Streamlit application backed by SQLite, organised so that all domain logic is free of interface code, and is covered by 696 automated tests.</w:t>
+        <w:t>The implementation is a single Streamlit application backed by SQLite, organised so that all domain logic is free of interface code, and is covered by 698 automated tests.</w:t>
       </w:r>
     </w:p>
     <w:p>
@@ -2619,7 +2619,7 @@
           <w:rFonts w:ascii="Times New Roman" w:hAnsi="Times New Roman"/>
           <w:sz w:val="24"/>
         </w:rPr>
-        <w:t>The rule is worth the discipline for three reasons. The domain becomes testable without a browser, which is why 589 of the project's 696 tests need no interface at all. Access control becomes a property of a function signature — every service function takes the acting user as its first argument and filters the database query by it — rather than something the interface is trusted to do. And if Streamlit ever became the limiting factor, the interface could be replaced without rewriting the system.</w:t>
+        <w:t>The rule is worth the discipline for three reasons. The domain becomes testable without a browser, which is why 589 of the project's 698 tests need no interface at all. Access control becomes a property of a function signature — every service function takes the acting user as its first argument and filters the database query by it — rather than something the interface is trusted to do. And if Streamlit ever became the limiting factor, the interface could be replaced without rewriting the system.</w:t>
       </w:r>
     </w:p>
     <w:p>
@@ -4208,7 +4208,7 @@
           <w:rFonts w:ascii="Times New Roman" w:hAnsi="Times New Roman"/>
           <w:sz w:val="24"/>
         </w:rPr>
-        <w:t>The project has 696 automated tests, all passing. They are summarised by area below; the complete run is kept with the source code in docs/test-report.txt.</w:t>
+        <w:t>The project has 698 automated tests, all passing. They are summarised by area below; the complete run is kept with the source code in docs/test-report.txt.</w:t>
       </w:r>
     </w:p>
     <w:tbl>

</xml_diff>